<commit_message>
feat: single shared entry - Participant / Researcher chooser on home page
One URL to hand out: the home page asks whether you're a participant (start the
study) or a researcher (go to the console), instead of needing two separate URLs.
README + user-guide doc updated.
</commit_message>
<xml_diff>
--- a/FatigueIDPro_User_Guide.docx
+++ b/FatigueIDPro_User_Guide.docx
@@ -111,7 +111,7 @@
     </w:p>
     <w:p>
       <w:r>
-        <w:t>Start the app (npm run dev) and open these pages:</w:t>
+        <w:t>Start the app (npm run dev). There is one link to share — the home page asks whether the person is a Participant or a Researcher:</w:t>
       </w:r>
     </w:p>
     <w:p>
@@ -119,15 +119,7 @@
         <w:pStyle w:val="ListBullet"/>
       </w:pPr>
       <w:r>
-        <w:t>/  — the participant experiment.</w:t>
-      </w:r>
-    </w:p>
-    <w:p>
-      <w:pPr>
-        <w:pStyle w:val="ListBullet"/>
-      </w:pPr>
-      <w:r>
-        <w:t>/admin.html  — the research console (sign in here).</w:t>
+        <w:t>/  — Home: choose 'I'm a Participant' (start the study) or 'Researcher / Admin' (the console).</w:t>
       </w:r>
     </w:p>
     <w:p>
@@ -189,7 +181,7 @@
         <w:pStyle w:val="ListNumber"/>
       </w:pPr>
       <w:r>
-        <w:t>Give the participant an ID and open the experiment page on their device.</w:t>
+        <w:t>Open the link on their device and tap 'I'm a Participant'. Give them their ID.</w:t>
       </w:r>
     </w:p>
     <w:p>

</xml_diff>